<commit_message>
updated Static Analysis Report (diagram text overlays / image resolution and license text)
</commit_message>
<xml_diff>
--- a/source/reference_documents/secondary_documents/implementation phase/Static Analysis Report/Static Analysis Report.docx
+++ b/source/reference_documents/secondary_documents/implementation phase/Static Analysis Report/Static Analysis Report.docx
@@ -1,6 +1,6 @@
 
 <file path=word/document.xml><?xml version="1.0" encoding="utf-8"?>
-<w:document xmlns:wpc="http://schemas.microsoft.com/office/word/2010/wordprocessingCanvas" xmlns:cx="http://schemas.microsoft.com/office/drawing/2014/chartex" xmlns:cx1="http://schemas.microsoft.com/office/drawing/2015/9/8/chartex" xmlns:cx2="http://schemas.microsoft.com/office/drawing/2015/10/21/chartex" xmlns:cx3="http://schemas.microsoft.com/office/drawing/2016/5/9/chartex" xmlns:cx4="http://schemas.microsoft.com/office/drawing/2016/5/10/chartex" xmlns:cx5="http://schemas.microsoft.com/office/drawing/2016/5/11/chartex" xmlns:cx6="http://schemas.microsoft.com/office/drawing/2016/5/12/chartex" xmlns:cx7="http://schemas.microsoft.com/office/drawing/2016/5/13/chartex" xmlns:cx8="http://schemas.microsoft.com/office/drawing/2016/5/14/chartex" xmlns:mc="http://schemas.openxmlformats.org/markup-compatibility/2006" xmlns:aink="http://schemas.microsoft.com/office/drawing/2016/ink" xmlns:am3d="http://schemas.microsoft.com/office/drawing/2017/model3d" xmlns:o="urn:schemas-microsoft-com:office:office" xmlns:oel="http://schemas.microsoft.com/office/2019/extlst" xmlns:r="http://schemas.openxmlformats.org/officeDocument/2006/relationships" xmlns:m="http://schemas.openxmlformats.org/officeDocument/2006/math" xmlns:v="urn:schemas-microsoft-com:vml" xmlns:wp14="http://schemas.microsoft.com/office/word/2010/wordprocessingDrawing" xmlns:wp="http://schemas.openxmlformats.org/drawingml/2006/wordprocessingDrawing" xmlns:w10="urn:schemas-microsoft-com:office:word" xmlns:w="http://schemas.openxmlformats.org/wordprocessingml/2006/main" xmlns:w14="http://schemas.microsoft.com/office/word/2010/wordml" xmlns:w15="http://schemas.microsoft.com/office/word/2012/wordml" xmlns:w16cex="http://schemas.microsoft.com/office/word/2018/wordml/cex" xmlns:w16cid="http://schemas.microsoft.com/office/word/2016/wordml/cid" xmlns:w16="http://schemas.microsoft.com/office/word/2018/wordml" xmlns:w16sdtdh="http://schemas.microsoft.com/office/word/2020/wordml/sdtdatahash" xmlns:w16se="http://schemas.microsoft.com/office/word/2015/wordml/symex" xmlns:wpg="http://schemas.microsoft.com/office/word/2010/wordprocessingGroup" xmlns:wpi="http://schemas.microsoft.com/office/word/2010/wordprocessingInk" xmlns:wne="http://schemas.microsoft.com/office/word/2006/wordml" xmlns:wps="http://schemas.microsoft.com/office/word/2010/wordprocessingShape" mc:Ignorable="w14 w15 w16se w16cid w16 w16cex w16sdtdh wp14">
+<w:document xmlns:wpc="http://schemas.microsoft.com/office/word/2010/wordprocessingCanvas" xmlns:cx="http://schemas.microsoft.com/office/drawing/2014/chartex" xmlns:cx1="http://schemas.microsoft.com/office/drawing/2015/9/8/chartex" xmlns:cx2="http://schemas.microsoft.com/office/drawing/2015/10/21/chartex" xmlns:cx3="http://schemas.microsoft.com/office/drawing/2016/5/9/chartex" xmlns:cx4="http://schemas.microsoft.com/office/drawing/2016/5/10/chartex" xmlns:cx5="http://schemas.microsoft.com/office/drawing/2016/5/11/chartex" xmlns:cx6="http://schemas.microsoft.com/office/drawing/2016/5/12/chartex" xmlns:cx7="http://schemas.microsoft.com/office/drawing/2016/5/13/chartex" xmlns:cx8="http://schemas.microsoft.com/office/drawing/2016/5/14/chartex" xmlns:mc="http://schemas.openxmlformats.org/markup-compatibility/2006" xmlns:aink="http://schemas.microsoft.com/office/drawing/2016/ink" xmlns:am3d="http://schemas.microsoft.com/office/drawing/2017/model3d" xmlns:o="urn:schemas-microsoft-com:office:office" xmlns:oel="http://schemas.microsoft.com/office/2019/extlst" xmlns:r="http://schemas.openxmlformats.org/officeDocument/2006/relationships" xmlns:m="http://schemas.openxmlformats.org/officeDocument/2006/math" xmlns:v="urn:schemas-microsoft-com:vml" xmlns:wp14="http://schemas.microsoft.com/office/word/2010/wordprocessingDrawing" xmlns:wp="http://schemas.openxmlformats.org/drawingml/2006/wordprocessingDrawing" xmlns:w10="urn:schemas-microsoft-com:office:word" xmlns:w="http://schemas.openxmlformats.org/wordprocessingml/2006/main" xmlns:w14="http://schemas.microsoft.com/office/word/2010/wordml" xmlns:w15="http://schemas.microsoft.com/office/word/2012/wordml" xmlns:w16cex="http://schemas.microsoft.com/office/word/2018/wordml/cex" xmlns:w16cid="http://schemas.microsoft.com/office/word/2016/wordml/cid" xmlns:w16="http://schemas.microsoft.com/office/word/2018/wordml" xmlns:w16du="http://schemas.microsoft.com/office/word/2023/wordml/word16du" xmlns:w16sdtdh="http://schemas.microsoft.com/office/word/2020/wordml/sdtdatahash" xmlns:w16sdtfl="http://schemas.microsoft.com/office/word/2024/wordml/sdtformatlock" xmlns:w16se="http://schemas.microsoft.com/office/word/2015/wordml/symex" xmlns:wpg="http://schemas.microsoft.com/office/word/2010/wordprocessingGroup" xmlns:wpi="http://schemas.microsoft.com/office/word/2010/wordprocessingInk" xmlns:wne="http://schemas.microsoft.com/office/word/2006/wordml" xmlns:wps="http://schemas.microsoft.com/office/word/2010/wordprocessingShape" mc:Ignorable="w14 w15 w16se w16cid w16 w16cex w16sdtdh w16sdtfl w16du wp14">
   <w:body>
     <w:p>
       <w:pPr>
@@ -28,7 +28,7 @@
         <w:t xml:space="preserve">Version </w:t>
       </w:r>
       <w:r>
-        <w:t>3</w:t>
+        <w:t>4</w:t>
       </w:r>
     </w:p>
     <w:p>
@@ -45,7 +45,7 @@
         <w:rPr>
           <w:noProof/>
         </w:rPr>
-        <w:t>9/8/23 12:22 PM</w:t>
+        <w:t>1/5/26 9:32 AM</w:t>
       </w:r>
       <w:r>
         <w:fldChar w:fldCharType="end"/>
@@ -183,45 +183,7 @@
         <w:jc w:val="both"/>
       </w:pPr>
       <w:r>
-        <w:t xml:space="preserve">This document is motivated by the need to have early security-related implementation feedback in the development of software for use within safety-critical, cyber-physical systems for certification of compliance to standards such as </w:t>
-      </w:r>
-      <w:r>
-        <w:rPr>
-          <w:b/>
-          <w:bCs/>
-        </w:rPr>
-        <w:t>ISO</w:t>
-      </w:r>
-      <w:r>
-        <w:rPr>
-          <w:b/>
-          <w:bCs/>
-        </w:rPr>
-        <w:t>/SAE</w:t>
-      </w:r>
-      <w:r>
-        <w:rPr>
-          <w:b/>
-          <w:bCs/>
-        </w:rPr>
-        <w:t xml:space="preserve"> 21434</w:t>
-      </w:r>
-      <w:r>
-        <w:t xml:space="preserve"> and </w:t>
-      </w:r>
-      <w:r>
-        <w:rPr>
-          <w:b/>
-          <w:bCs/>
-        </w:rPr>
-        <w:t xml:space="preserve">ISO </w:t>
-      </w:r>
-      <w:r>
-        <w:rPr>
-          <w:b/>
-          <w:bCs/>
-        </w:rPr>
-        <w:t>26262</w:t>
+        <w:t>This document is motivated by the need to have early security-related implementation feedback in the development of software for use within safety-critical, cyber-physical systems</w:t>
       </w:r>
       <w:r>
         <w:t>.</w:t>
@@ -252,14 +214,26 @@
         <w:rPr>
           <w:lang w:val="en-US"/>
         </w:rPr>
-        <w:t xml:space="preserve">was created by </w:t>
-      </w:r>
-      <w:r>
-        <w:rPr>
-          <w:b/>
-          <w:bCs/>
+        <w:t>was</w:t>
+      </w:r>
+      <w:r>
+        <w:rPr>
           <w:lang w:val="en-US"/>
         </w:rPr>
+        <w:t xml:space="preserve"> originally</w:t>
+      </w:r>
+      <w:r>
+        <w:rPr>
+          <w:lang w:val="en-US"/>
+        </w:rPr>
+        <w:t xml:space="preserve"> created by </w:t>
+      </w:r>
+      <w:r>
+        <w:rPr>
+          <w:b/>
+          <w:bCs/>
+          <w:lang w:val="en-US"/>
+        </w:rPr>
         <w:t>Motional</w:t>
       </w:r>
       <w:r>
@@ -280,7 +254,39 @@
           <w:bCs/>
           <w:lang w:val="en-US"/>
         </w:rPr>
-        <w:t>Creative Commons Attribution-Share Alike (CC4-SA)</w:t>
+        <w:t>Creative Commons Attribution-Share Alike (CC</w:t>
+      </w:r>
+      <w:r>
+        <w:rPr>
+          <w:b/>
+          <w:bCs/>
+          <w:lang w:val="en-US"/>
+        </w:rPr>
+        <w:t xml:space="preserve"> BY</w:t>
+      </w:r>
+      <w:r>
+        <w:rPr>
+          <w:b/>
+          <w:bCs/>
+          <w:lang w:val="en-US"/>
+        </w:rPr>
+        <w:t>-SA</w:t>
+      </w:r>
+      <w:r>
+        <w:rPr>
+          <w:b/>
+          <w:bCs/>
+          <w:lang w:val="en-US"/>
+        </w:rPr>
+        <w:t>-4.0</w:t>
+      </w:r>
+      <w:r>
+        <w:rPr>
+          <w:b/>
+          <w:bCs/>
+          <w:lang w:val="en-US"/>
+        </w:rPr>
+        <w:t>)</w:t>
       </w:r>
       <w:r>
         <w:rPr>
@@ -371,9 +377,9 @@
           <w:noProof/>
         </w:rPr>
         <w:drawing>
-          <wp:inline distT="0" distB="0" distL="0" distR="0" wp14:anchorId="2EB8A86E" wp14:editId="32B7D0F9">
-            <wp:extent cx="5965879" cy="2417577"/>
-            <wp:effectExtent l="0" t="0" r="3175" b="0"/>
+          <wp:inline distT="0" distB="0" distL="0" distR="0" wp14:anchorId="2EB8A86E" wp14:editId="40CB48A3">
+            <wp:extent cx="5961148" cy="2417577"/>
+            <wp:effectExtent l="0" t="0" r="0" b="0"/>
             <wp:docPr id="1" name="Picture 1"/>
             <wp:cNvGraphicFramePr>
               <a:graphicFrameLocks xmlns:a="http://schemas.openxmlformats.org/drawingml/2006/main" noChangeAspect="1"/>
@@ -386,7 +392,7 @@
                     <pic:cNvPicPr/>
                   </pic:nvPicPr>
                   <pic:blipFill>
-                    <a:blip r:embed="rId8">
+                    <a:blip r:embed="rId8" cstate="print">
                       <a:extLst>
                         <a:ext uri="{28A0092B-C50C-407E-A947-70E740481C1C}">
                           <a14:useLocalDpi xmlns:a14="http://schemas.microsoft.com/office/drawing/2010/main" val="0"/>
@@ -400,7 +406,7 @@
                   <pic:spPr>
                     <a:xfrm>
                       <a:off x="0" y="0"/>
-                      <a:ext cx="5965879" cy="2417577"/>
+                      <a:ext cx="5961148" cy="2417577"/>
                     </a:xfrm>
                     <a:prstGeom prst="rect">
                       <a:avLst/>
@@ -463,7 +469,6 @@
         <w:tc>
           <w:tcPr>
             <w:tcW w:w="1520" w:type="dxa"/>
-            <w:shd w:val="clear" w:color="auto" w:fill="auto"/>
             <w:tcMar>
               <w:top w:w="100" w:type="dxa"/>
               <w:left w:w="100" w:type="dxa"/>
@@ -501,7 +506,6 @@
         <w:tc>
           <w:tcPr>
             <w:tcW w:w="3780" w:type="dxa"/>
-            <w:shd w:val="clear" w:color="auto" w:fill="auto"/>
             <w:tcMar>
               <w:top w:w="100" w:type="dxa"/>
               <w:left w:w="100" w:type="dxa"/>
@@ -563,7 +567,6 @@
         <w:tc>
           <w:tcPr>
             <w:tcW w:w="1520" w:type="dxa"/>
-            <w:shd w:val="clear" w:color="auto" w:fill="auto"/>
             <w:tcMar>
               <w:top w:w="100" w:type="dxa"/>
               <w:left w:w="100" w:type="dxa"/>
@@ -601,7 +604,6 @@
         <w:tc>
           <w:tcPr>
             <w:tcW w:w="3780" w:type="dxa"/>
-            <w:shd w:val="clear" w:color="auto" w:fill="auto"/>
             <w:tcMar>
               <w:top w:w="100" w:type="dxa"/>
               <w:left w:w="100" w:type="dxa"/>
@@ -647,7 +649,6 @@
         <w:tc>
           <w:tcPr>
             <w:tcW w:w="1520" w:type="dxa"/>
-            <w:shd w:val="clear" w:color="auto" w:fill="auto"/>
             <w:tcMar>
               <w:top w:w="100" w:type="dxa"/>
               <w:left w:w="100" w:type="dxa"/>
@@ -685,7 +686,6 @@
         <w:tc>
           <w:tcPr>
             <w:tcW w:w="3780" w:type="dxa"/>
-            <w:shd w:val="clear" w:color="auto" w:fill="auto"/>
             <w:tcMar>
               <w:top w:w="100" w:type="dxa"/>
               <w:left w:w="100" w:type="dxa"/>
@@ -754,9 +754,9 @@
           <w:noProof/>
         </w:rPr>
         <w:drawing>
-          <wp:inline distT="0" distB="0" distL="0" distR="0" wp14:anchorId="27BAD293" wp14:editId="40B05A43">
-            <wp:extent cx="3705225" cy="4392970"/>
-            <wp:effectExtent l="0" t="0" r="3175" b="1270"/>
+          <wp:inline distT="0" distB="0" distL="0" distR="0" wp14:anchorId="27BAD293" wp14:editId="2E885FAD">
+            <wp:extent cx="3705785" cy="4393633"/>
+            <wp:effectExtent l="0" t="0" r="3175" b="635"/>
             <wp:docPr id="2" name="Picture 2"/>
             <wp:cNvGraphicFramePr>
               <a:graphicFrameLocks xmlns:a="http://schemas.openxmlformats.org/drawingml/2006/main" noChangeAspect="1"/>
@@ -769,7 +769,7 @@
                     <pic:cNvPicPr/>
                   </pic:nvPicPr>
                   <pic:blipFill>
-                    <a:blip r:embed="rId9">
+                    <a:blip r:embed="rId9" cstate="print">
                       <a:extLst>
                         <a:ext uri="{28A0092B-C50C-407E-A947-70E740481C1C}">
                           <a14:useLocalDpi xmlns:a14="http://schemas.microsoft.com/office/drawing/2010/main" val="0"/>
@@ -783,7 +783,7 @@
                   <pic:spPr>
                     <a:xfrm>
                       <a:off x="0" y="0"/>
-                      <a:ext cx="3705785" cy="4393634"/>
+                      <a:ext cx="3705785" cy="4393633"/>
                     </a:xfrm>
                     <a:prstGeom prst="rect">
                       <a:avLst/>
@@ -995,7 +995,6 @@
         <w:tc>
           <w:tcPr>
             <w:tcW w:w="1520" w:type="dxa"/>
-            <w:shd w:val="clear" w:color="auto" w:fill="auto"/>
             <w:tcMar>
               <w:top w:w="100" w:type="dxa"/>
               <w:left w:w="100" w:type="dxa"/>
@@ -1033,7 +1032,6 @@
         <w:tc>
           <w:tcPr>
             <w:tcW w:w="2610" w:type="dxa"/>
-            <w:shd w:val="clear" w:color="auto" w:fill="auto"/>
             <w:tcMar>
               <w:top w:w="100" w:type="dxa"/>
               <w:left w:w="100" w:type="dxa"/>
@@ -1082,7 +1080,6 @@
         <w:tc>
           <w:tcPr>
             <w:tcW w:w="1520" w:type="dxa"/>
-            <w:shd w:val="clear" w:color="auto" w:fill="auto"/>
             <w:tcMar>
               <w:top w:w="100" w:type="dxa"/>
               <w:left w:w="100" w:type="dxa"/>
@@ -1120,7 +1117,6 @@
         <w:tc>
           <w:tcPr>
             <w:tcW w:w="2610" w:type="dxa"/>
-            <w:shd w:val="clear" w:color="auto" w:fill="auto"/>
             <w:tcMar>
               <w:top w:w="100" w:type="dxa"/>
               <w:left w:w="100" w:type="dxa"/>
@@ -1150,7 +1146,6 @@
         <w:tc>
           <w:tcPr>
             <w:tcW w:w="1520" w:type="dxa"/>
-            <w:shd w:val="clear" w:color="auto" w:fill="auto"/>
             <w:tcMar>
               <w:top w:w="100" w:type="dxa"/>
               <w:left w:w="100" w:type="dxa"/>
@@ -1188,7 +1183,6 @@
         <w:tc>
           <w:tcPr>
             <w:tcW w:w="2610" w:type="dxa"/>
-            <w:shd w:val="clear" w:color="auto" w:fill="auto"/>
             <w:tcMar>
               <w:top w:w="100" w:type="dxa"/>
               <w:left w:w="100" w:type="dxa"/>
@@ -1233,8 +1227,8 @@
           <w:noProof/>
         </w:rPr>
         <w:drawing>
-          <wp:inline distT="0" distB="0" distL="0" distR="0" wp14:anchorId="0BA025CE" wp14:editId="014A3AEC">
-            <wp:extent cx="4410710" cy="4410710"/>
+          <wp:inline distT="0" distB="0" distL="0" distR="0" wp14:anchorId="0BA025CE" wp14:editId="57673C7D">
+            <wp:extent cx="4412730" cy="4412730"/>
             <wp:effectExtent l="0" t="0" r="0" b="0"/>
             <wp:docPr id="4" name="Picture 4"/>
             <wp:cNvGraphicFramePr>
@@ -1248,7 +1242,7 @@
                     <pic:cNvPicPr/>
                   </pic:nvPicPr>
                   <pic:blipFill>
-                    <a:blip r:embed="rId10">
+                    <a:blip r:embed="rId10" cstate="print">
                       <a:extLst>
                         <a:ext uri="{28A0092B-C50C-407E-A947-70E740481C1C}">
                           <a14:useLocalDpi xmlns:a14="http://schemas.microsoft.com/office/drawing/2010/main" val="0"/>
@@ -1456,7 +1450,6 @@
         <w:tc>
           <w:tcPr>
             <w:tcW w:w="1520" w:type="dxa"/>
-            <w:shd w:val="clear" w:color="auto" w:fill="auto"/>
             <w:tcMar>
               <w:top w:w="100" w:type="dxa"/>
               <w:left w:w="100" w:type="dxa"/>
@@ -1494,7 +1487,6 @@
         <w:tc>
           <w:tcPr>
             <w:tcW w:w="2610" w:type="dxa"/>
-            <w:shd w:val="clear" w:color="auto" w:fill="auto"/>
             <w:tcMar>
               <w:top w:w="100" w:type="dxa"/>
               <w:left w:w="100" w:type="dxa"/>
@@ -1524,7 +1516,6 @@
         <w:tc>
           <w:tcPr>
             <w:tcW w:w="1520" w:type="dxa"/>
-            <w:shd w:val="clear" w:color="auto" w:fill="auto"/>
             <w:tcMar>
               <w:top w:w="100" w:type="dxa"/>
               <w:left w:w="100" w:type="dxa"/>
@@ -1562,7 +1553,6 @@
         <w:tc>
           <w:tcPr>
             <w:tcW w:w="2610" w:type="dxa"/>
-            <w:shd w:val="clear" w:color="auto" w:fill="auto"/>
             <w:tcMar>
               <w:top w:w="100" w:type="dxa"/>
               <w:left w:w="100" w:type="dxa"/>
@@ -1608,7 +1598,6 @@
         <w:tc>
           <w:tcPr>
             <w:tcW w:w="1520" w:type="dxa"/>
-            <w:shd w:val="clear" w:color="auto" w:fill="auto"/>
             <w:tcMar>
               <w:top w:w="100" w:type="dxa"/>
               <w:left w:w="100" w:type="dxa"/>
@@ -1646,7 +1635,6 @@
         <w:tc>
           <w:tcPr>
             <w:tcW w:w="2610" w:type="dxa"/>
-            <w:shd w:val="clear" w:color="auto" w:fill="auto"/>
             <w:tcMar>
               <w:top w:w="100" w:type="dxa"/>
               <w:left w:w="100" w:type="dxa"/>
@@ -1699,9 +1687,9 @@
           <w:noProof/>
         </w:rPr>
         <w:drawing>
-          <wp:inline distT="0" distB="0" distL="0" distR="0" wp14:anchorId="6AFFAAB4" wp14:editId="2CA3B408">
-            <wp:extent cx="4554220" cy="4382687"/>
-            <wp:effectExtent l="0" t="0" r="0" b="0"/>
+          <wp:inline distT="0" distB="0" distL="0" distR="0" wp14:anchorId="6AFFAAB4" wp14:editId="65FA8904">
+            <wp:extent cx="4561920" cy="4390096"/>
+            <wp:effectExtent l="0" t="0" r="0" b="4445"/>
             <wp:docPr id="5" name="Picture 5"/>
             <wp:cNvGraphicFramePr>
               <a:graphicFrameLocks xmlns:a="http://schemas.openxmlformats.org/drawingml/2006/main" noChangeAspect="1"/>
@@ -1714,7 +1702,7 @@
                     <pic:cNvPicPr/>
                   </pic:nvPicPr>
                   <pic:blipFill>
-                    <a:blip r:embed="rId11">
+                    <a:blip r:embed="rId11" cstate="print">
                       <a:extLst>
                         <a:ext uri="{28A0092B-C50C-407E-A947-70E740481C1C}">
                           <a14:useLocalDpi xmlns:a14="http://schemas.microsoft.com/office/drawing/2010/main" val="0"/>
@@ -1728,7 +1716,7 @@
                   <pic:spPr>
                     <a:xfrm>
                       <a:off x="0" y="0"/>
-                      <a:ext cx="4561920" cy="4390097"/>
+                      <a:ext cx="4561920" cy="4390096"/>
                     </a:xfrm>
                     <a:prstGeom prst="rect">
                       <a:avLst/>
@@ -2573,7 +2561,7 @@
 </file>
 
 <file path=word/endnotes.xml><?xml version="1.0" encoding="utf-8"?>
-<w:endnotes xmlns:wpc="http://schemas.microsoft.com/office/word/2010/wordprocessingCanvas" xmlns:cx="http://schemas.microsoft.com/office/drawing/2014/chartex" xmlns:cx1="http://schemas.microsoft.com/office/drawing/2015/9/8/chartex" xmlns:cx2="http://schemas.microsoft.com/office/drawing/2015/10/21/chartex" xmlns:cx3="http://schemas.microsoft.com/office/drawing/2016/5/9/chartex" xmlns:cx4="http://schemas.microsoft.com/office/drawing/2016/5/10/chartex" xmlns:cx5="http://schemas.microsoft.com/office/drawing/2016/5/11/chartex" xmlns:cx6="http://schemas.microsoft.com/office/drawing/2016/5/12/chartex" xmlns:cx7="http://schemas.microsoft.com/office/drawing/2016/5/13/chartex" xmlns:cx8="http://schemas.microsoft.com/office/drawing/2016/5/14/chartex" xmlns:mc="http://schemas.openxmlformats.org/markup-compatibility/2006" xmlns:aink="http://schemas.microsoft.com/office/drawing/2016/ink" xmlns:am3d="http://schemas.microsoft.com/office/drawing/2017/model3d" xmlns:o="urn:schemas-microsoft-com:office:office" xmlns:oel="http://schemas.microsoft.com/office/2019/extlst" xmlns:r="http://schemas.openxmlformats.org/officeDocument/2006/relationships" xmlns:m="http://schemas.openxmlformats.org/officeDocument/2006/math" xmlns:v="urn:schemas-microsoft-com:vml" xmlns:wp14="http://schemas.microsoft.com/office/word/2010/wordprocessingDrawing" xmlns:wp="http://schemas.openxmlformats.org/drawingml/2006/wordprocessingDrawing" xmlns:w10="urn:schemas-microsoft-com:office:word" xmlns:w="http://schemas.openxmlformats.org/wordprocessingml/2006/main" xmlns:w14="http://schemas.microsoft.com/office/word/2010/wordml" xmlns:w15="http://schemas.microsoft.com/office/word/2012/wordml" xmlns:w16cex="http://schemas.microsoft.com/office/word/2018/wordml/cex" xmlns:w16cid="http://schemas.microsoft.com/office/word/2016/wordml/cid" xmlns:w16="http://schemas.microsoft.com/office/word/2018/wordml" xmlns:w16sdtdh="http://schemas.microsoft.com/office/word/2020/wordml/sdtdatahash" xmlns:w16se="http://schemas.microsoft.com/office/word/2015/wordml/symex" xmlns:wpg="http://schemas.microsoft.com/office/word/2010/wordprocessingGroup" xmlns:wpi="http://schemas.microsoft.com/office/word/2010/wordprocessingInk" xmlns:wne="http://schemas.microsoft.com/office/word/2006/wordml" xmlns:wps="http://schemas.microsoft.com/office/word/2010/wordprocessingShape" mc:Ignorable="w14 w15 w16se w16cid w16 w16cex w16sdtdh wp14">
+<w:endnotes xmlns:wpc="http://schemas.microsoft.com/office/word/2010/wordprocessingCanvas" xmlns:cx="http://schemas.microsoft.com/office/drawing/2014/chartex" xmlns:cx1="http://schemas.microsoft.com/office/drawing/2015/9/8/chartex" xmlns:cx2="http://schemas.microsoft.com/office/drawing/2015/10/21/chartex" xmlns:cx3="http://schemas.microsoft.com/office/drawing/2016/5/9/chartex" xmlns:cx4="http://schemas.microsoft.com/office/drawing/2016/5/10/chartex" xmlns:cx5="http://schemas.microsoft.com/office/drawing/2016/5/11/chartex" xmlns:cx6="http://schemas.microsoft.com/office/drawing/2016/5/12/chartex" xmlns:cx7="http://schemas.microsoft.com/office/drawing/2016/5/13/chartex" xmlns:cx8="http://schemas.microsoft.com/office/drawing/2016/5/14/chartex" xmlns:mc="http://schemas.openxmlformats.org/markup-compatibility/2006" xmlns:aink="http://schemas.microsoft.com/office/drawing/2016/ink" xmlns:am3d="http://schemas.microsoft.com/office/drawing/2017/model3d" xmlns:o="urn:schemas-microsoft-com:office:office" xmlns:oel="http://schemas.microsoft.com/office/2019/extlst" xmlns:r="http://schemas.openxmlformats.org/officeDocument/2006/relationships" xmlns:m="http://schemas.openxmlformats.org/officeDocument/2006/math" xmlns:v="urn:schemas-microsoft-com:vml" xmlns:wp14="http://schemas.microsoft.com/office/word/2010/wordprocessingDrawing" xmlns:wp="http://schemas.openxmlformats.org/drawingml/2006/wordprocessingDrawing" xmlns:w10="urn:schemas-microsoft-com:office:word" xmlns:w="http://schemas.openxmlformats.org/wordprocessingml/2006/main" xmlns:w14="http://schemas.microsoft.com/office/word/2010/wordml" xmlns:w15="http://schemas.microsoft.com/office/word/2012/wordml" xmlns:w16cex="http://schemas.microsoft.com/office/word/2018/wordml/cex" xmlns:w16cid="http://schemas.microsoft.com/office/word/2016/wordml/cid" xmlns:w16="http://schemas.microsoft.com/office/word/2018/wordml" xmlns:w16du="http://schemas.microsoft.com/office/word/2023/wordml/word16du" xmlns:w16sdtdh="http://schemas.microsoft.com/office/word/2020/wordml/sdtdatahash" xmlns:w16sdtfl="http://schemas.microsoft.com/office/word/2024/wordml/sdtformatlock" xmlns:w16se="http://schemas.microsoft.com/office/word/2015/wordml/symex" xmlns:wpg="http://schemas.microsoft.com/office/word/2010/wordprocessingGroup" xmlns:wpi="http://schemas.microsoft.com/office/word/2010/wordprocessingInk" xmlns:wne="http://schemas.microsoft.com/office/word/2006/wordml" xmlns:wps="http://schemas.microsoft.com/office/word/2010/wordprocessingShape" mc:Ignorable="w14 w15 w16se w16cid w16 w16cex w16sdtdh w16sdtfl w16du wp14">
   <w:endnote w:type="separator" w:id="-1">
     <w:p>
       <w:pPr>
@@ -2598,7 +2586,7 @@
 </file>
 
 <file path=word/footer1.xml><?xml version="1.0" encoding="utf-8"?>
-<w:ftr xmlns:wpc="http://schemas.microsoft.com/office/word/2010/wordprocessingCanvas" xmlns:cx="http://schemas.microsoft.com/office/drawing/2014/chartex" xmlns:cx1="http://schemas.microsoft.com/office/drawing/2015/9/8/chartex" xmlns:cx2="http://schemas.microsoft.com/office/drawing/2015/10/21/chartex" xmlns:cx3="http://schemas.microsoft.com/office/drawing/2016/5/9/chartex" xmlns:cx4="http://schemas.microsoft.com/office/drawing/2016/5/10/chartex" xmlns:cx5="http://schemas.microsoft.com/office/drawing/2016/5/11/chartex" xmlns:cx6="http://schemas.microsoft.com/office/drawing/2016/5/12/chartex" xmlns:cx7="http://schemas.microsoft.com/office/drawing/2016/5/13/chartex" xmlns:cx8="http://schemas.microsoft.com/office/drawing/2016/5/14/chartex" xmlns:mc="http://schemas.openxmlformats.org/markup-compatibility/2006" xmlns:aink="http://schemas.microsoft.com/office/drawing/2016/ink" xmlns:am3d="http://schemas.microsoft.com/office/drawing/2017/model3d" xmlns:o="urn:schemas-microsoft-com:office:office" xmlns:oel="http://schemas.microsoft.com/office/2019/extlst" xmlns:r="http://schemas.openxmlformats.org/officeDocument/2006/relationships" xmlns:m="http://schemas.openxmlformats.org/officeDocument/2006/math" xmlns:v="urn:schemas-microsoft-com:vml" xmlns:wp14="http://schemas.microsoft.com/office/word/2010/wordprocessingDrawing" xmlns:wp="http://schemas.openxmlformats.org/drawingml/2006/wordprocessingDrawing" xmlns:w10="urn:schemas-microsoft-com:office:word" xmlns:w="http://schemas.openxmlformats.org/wordprocessingml/2006/main" xmlns:w14="http://schemas.microsoft.com/office/word/2010/wordml" xmlns:w15="http://schemas.microsoft.com/office/word/2012/wordml" xmlns:w16cex="http://schemas.microsoft.com/office/word/2018/wordml/cex" xmlns:w16cid="http://schemas.microsoft.com/office/word/2016/wordml/cid" xmlns:w16="http://schemas.microsoft.com/office/word/2018/wordml" xmlns:w16sdtdh="http://schemas.microsoft.com/office/word/2020/wordml/sdtdatahash" xmlns:w16se="http://schemas.microsoft.com/office/word/2015/wordml/symex" xmlns:wpg="http://schemas.microsoft.com/office/word/2010/wordprocessingGroup" xmlns:wpi="http://schemas.microsoft.com/office/word/2010/wordprocessingInk" xmlns:wne="http://schemas.microsoft.com/office/word/2006/wordml" xmlns:wps="http://schemas.microsoft.com/office/word/2010/wordprocessingShape" mc:Ignorable="w14 w15 w16se w16cid w16 w16cex w16sdtdh wp14">
+<w:ftr xmlns:wpc="http://schemas.microsoft.com/office/word/2010/wordprocessingCanvas" xmlns:cx="http://schemas.microsoft.com/office/drawing/2014/chartex" xmlns:cx1="http://schemas.microsoft.com/office/drawing/2015/9/8/chartex" xmlns:cx2="http://schemas.microsoft.com/office/drawing/2015/10/21/chartex" xmlns:cx3="http://schemas.microsoft.com/office/drawing/2016/5/9/chartex" xmlns:cx4="http://schemas.microsoft.com/office/drawing/2016/5/10/chartex" xmlns:cx5="http://schemas.microsoft.com/office/drawing/2016/5/11/chartex" xmlns:cx6="http://schemas.microsoft.com/office/drawing/2016/5/12/chartex" xmlns:cx7="http://schemas.microsoft.com/office/drawing/2016/5/13/chartex" xmlns:cx8="http://schemas.microsoft.com/office/drawing/2016/5/14/chartex" xmlns:mc="http://schemas.openxmlformats.org/markup-compatibility/2006" xmlns:aink="http://schemas.microsoft.com/office/drawing/2016/ink" xmlns:am3d="http://schemas.microsoft.com/office/drawing/2017/model3d" xmlns:o="urn:schemas-microsoft-com:office:office" xmlns:oel="http://schemas.microsoft.com/office/2019/extlst" xmlns:r="http://schemas.openxmlformats.org/officeDocument/2006/relationships" xmlns:m="http://schemas.openxmlformats.org/officeDocument/2006/math" xmlns:v="urn:schemas-microsoft-com:vml" xmlns:wp14="http://schemas.microsoft.com/office/word/2010/wordprocessingDrawing" xmlns:wp="http://schemas.openxmlformats.org/drawingml/2006/wordprocessingDrawing" xmlns:w10="urn:schemas-microsoft-com:office:word" xmlns:w="http://schemas.openxmlformats.org/wordprocessingml/2006/main" xmlns:w14="http://schemas.microsoft.com/office/word/2010/wordml" xmlns:w15="http://schemas.microsoft.com/office/word/2012/wordml" xmlns:w16cex="http://schemas.microsoft.com/office/word/2018/wordml/cex" xmlns:w16cid="http://schemas.microsoft.com/office/word/2016/wordml/cid" xmlns:w16="http://schemas.microsoft.com/office/word/2018/wordml" xmlns:w16du="http://schemas.microsoft.com/office/word/2023/wordml/word16du" xmlns:w16sdtdh="http://schemas.microsoft.com/office/word/2020/wordml/sdtdatahash" xmlns:w16sdtfl="http://schemas.microsoft.com/office/word/2024/wordml/sdtformatlock" xmlns:w16se="http://schemas.microsoft.com/office/word/2015/wordml/symex" xmlns:wpg="http://schemas.microsoft.com/office/word/2010/wordprocessingGroup" xmlns:wpi="http://schemas.microsoft.com/office/word/2010/wordprocessingInk" xmlns:wne="http://schemas.microsoft.com/office/word/2006/wordml" xmlns:wps="http://schemas.microsoft.com/office/word/2010/wordprocessingShape" mc:Ignorable="w14 w15 w16se w16cid w16 w16cex w16sdtdh w16sdtfl w16du wp14">
   <w:sdt>
     <w:sdtPr>
       <w:rPr>
@@ -2650,7 +2638,7 @@
 </file>
 
 <file path=word/footer2.xml><?xml version="1.0" encoding="utf-8"?>
-<w:ftr xmlns:wpc="http://schemas.microsoft.com/office/word/2010/wordprocessingCanvas" xmlns:cx="http://schemas.microsoft.com/office/drawing/2014/chartex" xmlns:cx1="http://schemas.microsoft.com/office/drawing/2015/9/8/chartex" xmlns:cx2="http://schemas.microsoft.com/office/drawing/2015/10/21/chartex" xmlns:cx3="http://schemas.microsoft.com/office/drawing/2016/5/9/chartex" xmlns:cx4="http://schemas.microsoft.com/office/drawing/2016/5/10/chartex" xmlns:cx5="http://schemas.microsoft.com/office/drawing/2016/5/11/chartex" xmlns:cx6="http://schemas.microsoft.com/office/drawing/2016/5/12/chartex" xmlns:cx7="http://schemas.microsoft.com/office/drawing/2016/5/13/chartex" xmlns:cx8="http://schemas.microsoft.com/office/drawing/2016/5/14/chartex" xmlns:mc="http://schemas.openxmlformats.org/markup-compatibility/2006" xmlns:aink="http://schemas.microsoft.com/office/drawing/2016/ink" xmlns:am3d="http://schemas.microsoft.com/office/drawing/2017/model3d" xmlns:o="urn:schemas-microsoft-com:office:office" xmlns:oel="http://schemas.microsoft.com/office/2019/extlst" xmlns:r="http://schemas.openxmlformats.org/officeDocument/2006/relationships" xmlns:m="http://schemas.openxmlformats.org/officeDocument/2006/math" xmlns:v="urn:schemas-microsoft-com:vml" xmlns:wp14="http://schemas.microsoft.com/office/word/2010/wordprocessingDrawing" xmlns:wp="http://schemas.openxmlformats.org/drawingml/2006/wordprocessingDrawing" xmlns:w10="urn:schemas-microsoft-com:office:word" xmlns:w="http://schemas.openxmlformats.org/wordprocessingml/2006/main" xmlns:w14="http://schemas.microsoft.com/office/word/2010/wordml" xmlns:w15="http://schemas.microsoft.com/office/word/2012/wordml" xmlns:w16cex="http://schemas.microsoft.com/office/word/2018/wordml/cex" xmlns:w16cid="http://schemas.microsoft.com/office/word/2016/wordml/cid" xmlns:w16="http://schemas.microsoft.com/office/word/2018/wordml" xmlns:w16sdtdh="http://schemas.microsoft.com/office/word/2020/wordml/sdtdatahash" xmlns:w16se="http://schemas.microsoft.com/office/word/2015/wordml/symex" xmlns:wpg="http://schemas.microsoft.com/office/word/2010/wordprocessingGroup" xmlns:wpi="http://schemas.microsoft.com/office/word/2010/wordprocessingInk" xmlns:wne="http://schemas.microsoft.com/office/word/2006/wordml" xmlns:wps="http://schemas.microsoft.com/office/word/2010/wordprocessingShape" mc:Ignorable="w14 w15 w16se w16cid w16 w16cex w16sdtdh wp14">
+<w:ftr xmlns:wpc="http://schemas.microsoft.com/office/word/2010/wordprocessingCanvas" xmlns:cx="http://schemas.microsoft.com/office/drawing/2014/chartex" xmlns:cx1="http://schemas.microsoft.com/office/drawing/2015/9/8/chartex" xmlns:cx2="http://schemas.microsoft.com/office/drawing/2015/10/21/chartex" xmlns:cx3="http://schemas.microsoft.com/office/drawing/2016/5/9/chartex" xmlns:cx4="http://schemas.microsoft.com/office/drawing/2016/5/10/chartex" xmlns:cx5="http://schemas.microsoft.com/office/drawing/2016/5/11/chartex" xmlns:cx6="http://schemas.microsoft.com/office/drawing/2016/5/12/chartex" xmlns:cx7="http://schemas.microsoft.com/office/drawing/2016/5/13/chartex" xmlns:cx8="http://schemas.microsoft.com/office/drawing/2016/5/14/chartex" xmlns:mc="http://schemas.openxmlformats.org/markup-compatibility/2006" xmlns:aink="http://schemas.microsoft.com/office/drawing/2016/ink" xmlns:am3d="http://schemas.microsoft.com/office/drawing/2017/model3d" xmlns:o="urn:schemas-microsoft-com:office:office" xmlns:oel="http://schemas.microsoft.com/office/2019/extlst" xmlns:r="http://schemas.openxmlformats.org/officeDocument/2006/relationships" xmlns:m="http://schemas.openxmlformats.org/officeDocument/2006/math" xmlns:v="urn:schemas-microsoft-com:vml" xmlns:wp14="http://schemas.microsoft.com/office/word/2010/wordprocessingDrawing" xmlns:wp="http://schemas.openxmlformats.org/drawingml/2006/wordprocessingDrawing" xmlns:w10="urn:schemas-microsoft-com:office:word" xmlns:w="http://schemas.openxmlformats.org/wordprocessingml/2006/main" xmlns:w14="http://schemas.microsoft.com/office/word/2010/wordml" xmlns:w15="http://schemas.microsoft.com/office/word/2012/wordml" xmlns:w16cex="http://schemas.microsoft.com/office/word/2018/wordml/cex" xmlns:w16cid="http://schemas.microsoft.com/office/word/2016/wordml/cid" xmlns:w16="http://schemas.microsoft.com/office/word/2018/wordml" xmlns:w16du="http://schemas.microsoft.com/office/word/2023/wordml/word16du" xmlns:w16sdtdh="http://schemas.microsoft.com/office/word/2020/wordml/sdtdatahash" xmlns:w16sdtfl="http://schemas.microsoft.com/office/word/2024/wordml/sdtformatlock" xmlns:w16se="http://schemas.microsoft.com/office/word/2015/wordml/symex" xmlns:wpg="http://schemas.microsoft.com/office/word/2010/wordprocessingGroup" xmlns:wpi="http://schemas.microsoft.com/office/word/2010/wordprocessingInk" xmlns:wne="http://schemas.microsoft.com/office/word/2006/wordml" xmlns:wps="http://schemas.microsoft.com/office/word/2010/wordprocessingShape" mc:Ignorable="w14 w15 w16se w16cid w16 w16cex w16sdtdh w16sdtfl w16du wp14">
   <w:sdt>
     <w:sdtPr>
       <w:rPr>
@@ -2715,7 +2703,7 @@
 </file>
 
 <file path=word/footnotes.xml><?xml version="1.0" encoding="utf-8"?>
-<w:footnotes xmlns:wpc="http://schemas.microsoft.com/office/word/2010/wordprocessingCanvas" xmlns:cx="http://schemas.microsoft.com/office/drawing/2014/chartex" xmlns:cx1="http://schemas.microsoft.com/office/drawing/2015/9/8/chartex" xmlns:cx2="http://schemas.microsoft.com/office/drawing/2015/10/21/chartex" xmlns:cx3="http://schemas.microsoft.com/office/drawing/2016/5/9/chartex" xmlns:cx4="http://schemas.microsoft.com/office/drawing/2016/5/10/chartex" xmlns:cx5="http://schemas.microsoft.com/office/drawing/2016/5/11/chartex" xmlns:cx6="http://schemas.microsoft.com/office/drawing/2016/5/12/chartex" xmlns:cx7="http://schemas.microsoft.com/office/drawing/2016/5/13/chartex" xmlns:cx8="http://schemas.microsoft.com/office/drawing/2016/5/14/chartex" xmlns:mc="http://schemas.openxmlformats.org/markup-compatibility/2006" xmlns:aink="http://schemas.microsoft.com/office/drawing/2016/ink" xmlns:am3d="http://schemas.microsoft.com/office/drawing/2017/model3d" xmlns:o="urn:schemas-microsoft-com:office:office" xmlns:oel="http://schemas.microsoft.com/office/2019/extlst" xmlns:r="http://schemas.openxmlformats.org/officeDocument/2006/relationships" xmlns:m="http://schemas.openxmlformats.org/officeDocument/2006/math" xmlns:v="urn:schemas-microsoft-com:vml" xmlns:wp14="http://schemas.microsoft.com/office/word/2010/wordprocessingDrawing" xmlns:wp="http://schemas.openxmlformats.org/drawingml/2006/wordprocessingDrawing" xmlns:w10="urn:schemas-microsoft-com:office:word" xmlns:w="http://schemas.openxmlformats.org/wordprocessingml/2006/main" xmlns:w14="http://schemas.microsoft.com/office/word/2010/wordml" xmlns:w15="http://schemas.microsoft.com/office/word/2012/wordml" xmlns:w16cex="http://schemas.microsoft.com/office/word/2018/wordml/cex" xmlns:w16cid="http://schemas.microsoft.com/office/word/2016/wordml/cid" xmlns:w16="http://schemas.microsoft.com/office/word/2018/wordml" xmlns:w16sdtdh="http://schemas.microsoft.com/office/word/2020/wordml/sdtdatahash" xmlns:w16se="http://schemas.microsoft.com/office/word/2015/wordml/symex" xmlns:wpg="http://schemas.microsoft.com/office/word/2010/wordprocessingGroup" xmlns:wpi="http://schemas.microsoft.com/office/word/2010/wordprocessingInk" xmlns:wne="http://schemas.microsoft.com/office/word/2006/wordml" xmlns:wps="http://schemas.microsoft.com/office/word/2010/wordprocessingShape" mc:Ignorable="w14 w15 w16se w16cid w16 w16cex w16sdtdh wp14">
+<w:footnotes xmlns:wpc="http://schemas.microsoft.com/office/word/2010/wordprocessingCanvas" xmlns:cx="http://schemas.microsoft.com/office/drawing/2014/chartex" xmlns:cx1="http://schemas.microsoft.com/office/drawing/2015/9/8/chartex" xmlns:cx2="http://schemas.microsoft.com/office/drawing/2015/10/21/chartex" xmlns:cx3="http://schemas.microsoft.com/office/drawing/2016/5/9/chartex" xmlns:cx4="http://schemas.microsoft.com/office/drawing/2016/5/10/chartex" xmlns:cx5="http://schemas.microsoft.com/office/drawing/2016/5/11/chartex" xmlns:cx6="http://schemas.microsoft.com/office/drawing/2016/5/12/chartex" xmlns:cx7="http://schemas.microsoft.com/office/drawing/2016/5/13/chartex" xmlns:cx8="http://schemas.microsoft.com/office/drawing/2016/5/14/chartex" xmlns:mc="http://schemas.openxmlformats.org/markup-compatibility/2006" xmlns:aink="http://schemas.microsoft.com/office/drawing/2016/ink" xmlns:am3d="http://schemas.microsoft.com/office/drawing/2017/model3d" xmlns:o="urn:schemas-microsoft-com:office:office" xmlns:oel="http://schemas.microsoft.com/office/2019/extlst" xmlns:r="http://schemas.openxmlformats.org/officeDocument/2006/relationships" xmlns:m="http://schemas.openxmlformats.org/officeDocument/2006/math" xmlns:v="urn:schemas-microsoft-com:vml" xmlns:wp14="http://schemas.microsoft.com/office/word/2010/wordprocessingDrawing" xmlns:wp="http://schemas.openxmlformats.org/drawingml/2006/wordprocessingDrawing" xmlns:w10="urn:schemas-microsoft-com:office:word" xmlns:w="http://schemas.openxmlformats.org/wordprocessingml/2006/main" xmlns:w14="http://schemas.microsoft.com/office/word/2010/wordml" xmlns:w15="http://schemas.microsoft.com/office/word/2012/wordml" xmlns:w16cex="http://schemas.microsoft.com/office/word/2018/wordml/cex" xmlns:w16cid="http://schemas.microsoft.com/office/word/2016/wordml/cid" xmlns:w16="http://schemas.microsoft.com/office/word/2018/wordml" xmlns:w16du="http://schemas.microsoft.com/office/word/2023/wordml/word16du" xmlns:w16sdtdh="http://schemas.microsoft.com/office/word/2020/wordml/sdtdatahash" xmlns:w16sdtfl="http://schemas.microsoft.com/office/word/2024/wordml/sdtformatlock" xmlns:w16se="http://schemas.microsoft.com/office/word/2015/wordml/symex" xmlns:wpg="http://schemas.microsoft.com/office/word/2010/wordprocessingGroup" xmlns:wpi="http://schemas.microsoft.com/office/word/2010/wordprocessingInk" xmlns:wne="http://schemas.microsoft.com/office/word/2006/wordml" xmlns:wps="http://schemas.microsoft.com/office/word/2010/wordprocessingShape" mc:Ignorable="w14 w15 w16se w16cid w16 w16cex w16sdtdh w16sdtfl w16du wp14">
   <w:footnote w:type="separator" w:id="-1">
     <w:p>
       <w:pPr>
@@ -2740,7 +2728,7 @@
 </file>
 
 <file path=word/header1.xml><?xml version="1.0" encoding="utf-8"?>
-<w:hdr xmlns:wpc="http://schemas.microsoft.com/office/word/2010/wordprocessingCanvas" xmlns:cx="http://schemas.microsoft.com/office/drawing/2014/chartex" xmlns:cx1="http://schemas.microsoft.com/office/drawing/2015/9/8/chartex" xmlns:cx2="http://schemas.microsoft.com/office/drawing/2015/10/21/chartex" xmlns:cx3="http://schemas.microsoft.com/office/drawing/2016/5/9/chartex" xmlns:cx4="http://schemas.microsoft.com/office/drawing/2016/5/10/chartex" xmlns:cx5="http://schemas.microsoft.com/office/drawing/2016/5/11/chartex" xmlns:cx6="http://schemas.microsoft.com/office/drawing/2016/5/12/chartex" xmlns:cx7="http://schemas.microsoft.com/office/drawing/2016/5/13/chartex" xmlns:cx8="http://schemas.microsoft.com/office/drawing/2016/5/14/chartex" xmlns:mc="http://schemas.openxmlformats.org/markup-compatibility/2006" xmlns:aink="http://schemas.microsoft.com/office/drawing/2016/ink" xmlns:am3d="http://schemas.microsoft.com/office/drawing/2017/model3d" xmlns:o="urn:schemas-microsoft-com:office:office" xmlns:oel="http://schemas.microsoft.com/office/2019/extlst" xmlns:r="http://schemas.openxmlformats.org/officeDocument/2006/relationships" xmlns:m="http://schemas.openxmlformats.org/officeDocument/2006/math" xmlns:v="urn:schemas-microsoft-com:vml" xmlns:wp14="http://schemas.microsoft.com/office/word/2010/wordprocessingDrawing" xmlns:wp="http://schemas.openxmlformats.org/drawingml/2006/wordprocessingDrawing" xmlns:w10="urn:schemas-microsoft-com:office:word" xmlns:w="http://schemas.openxmlformats.org/wordprocessingml/2006/main" xmlns:w14="http://schemas.microsoft.com/office/word/2010/wordml" xmlns:w15="http://schemas.microsoft.com/office/word/2012/wordml" xmlns:w16cex="http://schemas.microsoft.com/office/word/2018/wordml/cex" xmlns:w16cid="http://schemas.microsoft.com/office/word/2016/wordml/cid" xmlns:w16="http://schemas.microsoft.com/office/word/2018/wordml" xmlns:w16sdtdh="http://schemas.microsoft.com/office/word/2020/wordml/sdtdatahash" xmlns:w16se="http://schemas.microsoft.com/office/word/2015/wordml/symex" xmlns:wpg="http://schemas.microsoft.com/office/word/2010/wordprocessingGroup" xmlns:wpi="http://schemas.microsoft.com/office/word/2010/wordprocessingInk" xmlns:wne="http://schemas.microsoft.com/office/word/2006/wordml" xmlns:wps="http://schemas.microsoft.com/office/word/2010/wordprocessingShape" mc:Ignorable="w14 w15 w16se w16cid w16 w16cex w16sdtdh wp14">
+<w:hdr xmlns:wpc="http://schemas.microsoft.com/office/word/2010/wordprocessingCanvas" xmlns:cx="http://schemas.microsoft.com/office/drawing/2014/chartex" xmlns:cx1="http://schemas.microsoft.com/office/drawing/2015/9/8/chartex" xmlns:cx2="http://schemas.microsoft.com/office/drawing/2015/10/21/chartex" xmlns:cx3="http://schemas.microsoft.com/office/drawing/2016/5/9/chartex" xmlns:cx4="http://schemas.microsoft.com/office/drawing/2016/5/10/chartex" xmlns:cx5="http://schemas.microsoft.com/office/drawing/2016/5/11/chartex" xmlns:cx6="http://schemas.microsoft.com/office/drawing/2016/5/12/chartex" xmlns:cx7="http://schemas.microsoft.com/office/drawing/2016/5/13/chartex" xmlns:cx8="http://schemas.microsoft.com/office/drawing/2016/5/14/chartex" xmlns:mc="http://schemas.openxmlformats.org/markup-compatibility/2006" xmlns:aink="http://schemas.microsoft.com/office/drawing/2016/ink" xmlns:am3d="http://schemas.microsoft.com/office/drawing/2017/model3d" xmlns:o="urn:schemas-microsoft-com:office:office" xmlns:oel="http://schemas.microsoft.com/office/2019/extlst" xmlns:r="http://schemas.openxmlformats.org/officeDocument/2006/relationships" xmlns:m="http://schemas.openxmlformats.org/officeDocument/2006/math" xmlns:v="urn:schemas-microsoft-com:vml" xmlns:wp14="http://schemas.microsoft.com/office/word/2010/wordprocessingDrawing" xmlns:wp="http://schemas.openxmlformats.org/drawingml/2006/wordprocessingDrawing" xmlns:w10="urn:schemas-microsoft-com:office:word" xmlns:w="http://schemas.openxmlformats.org/wordprocessingml/2006/main" xmlns:w14="http://schemas.microsoft.com/office/word/2010/wordml" xmlns:w15="http://schemas.microsoft.com/office/word/2012/wordml" xmlns:w16cex="http://schemas.microsoft.com/office/word/2018/wordml/cex" xmlns:w16cid="http://schemas.microsoft.com/office/word/2016/wordml/cid" xmlns:w16="http://schemas.microsoft.com/office/word/2018/wordml" xmlns:w16du="http://schemas.microsoft.com/office/word/2023/wordml/word16du" xmlns:w16sdtdh="http://schemas.microsoft.com/office/word/2020/wordml/sdtdatahash" xmlns:w16sdtfl="http://schemas.microsoft.com/office/word/2024/wordml/sdtformatlock" xmlns:w16se="http://schemas.microsoft.com/office/word/2015/wordml/symex" xmlns:wpg="http://schemas.microsoft.com/office/word/2010/wordprocessingGroup" xmlns:wpi="http://schemas.microsoft.com/office/word/2010/wordprocessingInk" xmlns:wne="http://schemas.microsoft.com/office/word/2006/wordml" xmlns:wps="http://schemas.microsoft.com/office/word/2010/wordprocessingShape" mc:Ignorable="w14 w15 w16se w16cid w16 w16cex w16sdtdh w16sdtfl w16du wp14">
   <w:p>
     <w:pPr>
       <w:pStyle w:val="Header"/>
@@ -2757,7 +2745,7 @@
 </file>
 
 <file path=word/numbering.xml><?xml version="1.0" encoding="utf-8"?>
-<w:numbering xmlns:wpc="http://schemas.microsoft.com/office/word/2010/wordprocessingCanvas" xmlns:cx="http://schemas.microsoft.com/office/drawing/2014/chartex" xmlns:cx1="http://schemas.microsoft.com/office/drawing/2015/9/8/chartex" xmlns:cx2="http://schemas.microsoft.com/office/drawing/2015/10/21/chartex" xmlns:cx3="http://schemas.microsoft.com/office/drawing/2016/5/9/chartex" xmlns:cx4="http://schemas.microsoft.com/office/drawing/2016/5/10/chartex" xmlns:cx5="http://schemas.microsoft.com/office/drawing/2016/5/11/chartex" xmlns:cx6="http://schemas.microsoft.com/office/drawing/2016/5/12/chartex" xmlns:cx7="http://schemas.microsoft.com/office/drawing/2016/5/13/chartex" xmlns:cx8="http://schemas.microsoft.com/office/drawing/2016/5/14/chartex" xmlns:mc="http://schemas.openxmlformats.org/markup-compatibility/2006" xmlns:aink="http://schemas.microsoft.com/office/drawing/2016/ink" xmlns:am3d="http://schemas.microsoft.com/office/drawing/2017/model3d" xmlns:o="urn:schemas-microsoft-com:office:office" xmlns:oel="http://schemas.microsoft.com/office/2019/extlst" xmlns:r="http://schemas.openxmlformats.org/officeDocument/2006/relationships" xmlns:m="http://schemas.openxmlformats.org/officeDocument/2006/math" xmlns:v="urn:schemas-microsoft-com:vml" xmlns:wp14="http://schemas.microsoft.com/office/word/2010/wordprocessingDrawing" xmlns:wp="http://schemas.openxmlformats.org/drawingml/2006/wordprocessingDrawing" xmlns:w10="urn:schemas-microsoft-com:office:word" xmlns:w="http://schemas.openxmlformats.org/wordprocessingml/2006/main" xmlns:w14="http://schemas.microsoft.com/office/word/2010/wordml" xmlns:w15="http://schemas.microsoft.com/office/word/2012/wordml" xmlns:w16cex="http://schemas.microsoft.com/office/word/2018/wordml/cex" xmlns:w16cid="http://schemas.microsoft.com/office/word/2016/wordml/cid" xmlns:w16="http://schemas.microsoft.com/office/word/2018/wordml" xmlns:w16sdtdh="http://schemas.microsoft.com/office/word/2020/wordml/sdtdatahash" xmlns:w16se="http://schemas.microsoft.com/office/word/2015/wordml/symex" xmlns:wpg="http://schemas.microsoft.com/office/word/2010/wordprocessingGroup" xmlns:wpi="http://schemas.microsoft.com/office/word/2010/wordprocessingInk" xmlns:wne="http://schemas.microsoft.com/office/word/2006/wordml" xmlns:wps="http://schemas.microsoft.com/office/word/2010/wordprocessingShape" mc:Ignorable="w14 w15 w16se w16cid w16 w16cex w16sdtdh wp14">
+<w:numbering xmlns:wpc="http://schemas.microsoft.com/office/word/2010/wordprocessingCanvas" xmlns:cx="http://schemas.microsoft.com/office/drawing/2014/chartex" xmlns:cx1="http://schemas.microsoft.com/office/drawing/2015/9/8/chartex" xmlns:cx2="http://schemas.microsoft.com/office/drawing/2015/10/21/chartex" xmlns:cx3="http://schemas.microsoft.com/office/drawing/2016/5/9/chartex" xmlns:cx4="http://schemas.microsoft.com/office/drawing/2016/5/10/chartex" xmlns:cx5="http://schemas.microsoft.com/office/drawing/2016/5/11/chartex" xmlns:cx6="http://schemas.microsoft.com/office/drawing/2016/5/12/chartex" xmlns:cx7="http://schemas.microsoft.com/office/drawing/2016/5/13/chartex" xmlns:cx8="http://schemas.microsoft.com/office/drawing/2016/5/14/chartex" xmlns:mc="http://schemas.openxmlformats.org/markup-compatibility/2006" xmlns:aink="http://schemas.microsoft.com/office/drawing/2016/ink" xmlns:am3d="http://schemas.microsoft.com/office/drawing/2017/model3d" xmlns:o="urn:schemas-microsoft-com:office:office" xmlns:oel="http://schemas.microsoft.com/office/2019/extlst" xmlns:r="http://schemas.openxmlformats.org/officeDocument/2006/relationships" xmlns:m="http://schemas.openxmlformats.org/officeDocument/2006/math" xmlns:v="urn:schemas-microsoft-com:vml" xmlns:wp14="http://schemas.microsoft.com/office/word/2010/wordprocessingDrawing" xmlns:wp="http://schemas.openxmlformats.org/drawingml/2006/wordprocessingDrawing" xmlns:w10="urn:schemas-microsoft-com:office:word" xmlns:w="http://schemas.openxmlformats.org/wordprocessingml/2006/main" xmlns:w14="http://schemas.microsoft.com/office/word/2010/wordml" xmlns:w15="http://schemas.microsoft.com/office/word/2012/wordml" xmlns:w16cex="http://schemas.microsoft.com/office/word/2018/wordml/cex" xmlns:w16cid="http://schemas.microsoft.com/office/word/2016/wordml/cid" xmlns:w16="http://schemas.microsoft.com/office/word/2018/wordml" xmlns:w16du="http://schemas.microsoft.com/office/word/2023/wordml/word16du" xmlns:w16sdtdh="http://schemas.microsoft.com/office/word/2020/wordml/sdtdatahash" xmlns:w16sdtfl="http://schemas.microsoft.com/office/word/2024/wordml/sdtformatlock" xmlns:w16se="http://schemas.microsoft.com/office/word/2015/wordml/symex" xmlns:wpg="http://schemas.microsoft.com/office/word/2010/wordprocessingGroup" xmlns:wpi="http://schemas.microsoft.com/office/word/2010/wordprocessingInk" xmlns:wne="http://schemas.microsoft.com/office/word/2006/wordml" xmlns:wps="http://schemas.microsoft.com/office/word/2010/wordprocessingShape" mc:Ignorable="w14 w15 w16se w16cid w16 w16cex w16sdtdh w16sdtfl w16du wp14">
   <w:abstractNum w:abstractNumId="0" w15:restartNumberingAfterBreak="0">
     <w:nsid w:val="0C391F0A"/>
     <w:multiLevelType w:val="hybridMultilevel"/>
@@ -3547,7 +3535,7 @@
 </file>
 
 <file path=word/styles.xml><?xml version="1.0" encoding="utf-8"?>
-<w:styles xmlns:mc="http://schemas.openxmlformats.org/markup-compatibility/2006" xmlns:r="http://schemas.openxmlformats.org/officeDocument/2006/relationships" xmlns:w="http://schemas.openxmlformats.org/wordprocessingml/2006/main" xmlns:w14="http://schemas.microsoft.com/office/word/2010/wordml" xmlns:w15="http://schemas.microsoft.com/office/word/2012/wordml" xmlns:w16cex="http://schemas.microsoft.com/office/word/2018/wordml/cex" xmlns:w16cid="http://schemas.microsoft.com/office/word/2016/wordml/cid" xmlns:w16="http://schemas.microsoft.com/office/word/2018/wordml" xmlns:w16sdtdh="http://schemas.microsoft.com/office/word/2020/wordml/sdtdatahash" xmlns:w16se="http://schemas.microsoft.com/office/word/2015/wordml/symex" mc:Ignorable="w14 w15 w16se w16cid w16 w16cex w16sdtdh">
+<w:styles xmlns:mc="http://schemas.openxmlformats.org/markup-compatibility/2006" xmlns:r="http://schemas.openxmlformats.org/officeDocument/2006/relationships" xmlns:w="http://schemas.openxmlformats.org/wordprocessingml/2006/main" xmlns:w14="http://schemas.microsoft.com/office/word/2010/wordml" xmlns:w15="http://schemas.microsoft.com/office/word/2012/wordml" xmlns:w16cex="http://schemas.microsoft.com/office/word/2018/wordml/cex" xmlns:w16cid="http://schemas.microsoft.com/office/word/2016/wordml/cid" xmlns:w16="http://schemas.microsoft.com/office/word/2018/wordml" xmlns:w16du="http://schemas.microsoft.com/office/word/2023/wordml/word16du" xmlns:w16sdtdh="http://schemas.microsoft.com/office/word/2020/wordml/sdtdatahash" xmlns:w16sdtfl="http://schemas.microsoft.com/office/word/2024/wordml/sdtformatlock" xmlns:w16se="http://schemas.microsoft.com/office/word/2015/wordml/symex" mc:Ignorable="w14 w15 w16se w16cid w16 w16cex w16sdtdh w16sdtfl w16du">
   <w:docDefaults>
     <w:rPrDefault>
       <w:rPr>

</xml_diff>

<commit_message>
Updated Static Analysis Report secondary document (triage output should go to threat prioritization process)
</commit_message>
<xml_diff>
--- a/source/reference_documents/secondary_documents/implementation phase/Static Analysis Report/Static Analysis Report.docx
+++ b/source/reference_documents/secondary_documents/implementation phase/Static Analysis Report/Static Analysis Report.docx
@@ -28,7 +28,7 @@
         <w:t xml:space="preserve">Version </w:t>
       </w:r>
       <w:r>
-        <w:t>4</w:t>
+        <w:t>5</w:t>
       </w:r>
     </w:p>
     <w:p>
@@ -45,7 +45,7 @@
         <w:rPr>
           <w:noProof/>
         </w:rPr>
-        <w:t>1/5/26 9:32 AM</w:t>
+        <w:t>1/9/26 11:22 AM</w:t>
       </w:r>
       <w:r>
         <w:fldChar w:fldCharType="end"/>
@@ -377,8 +377,8 @@
           <w:noProof/>
         </w:rPr>
         <w:drawing>
-          <wp:inline distT="0" distB="0" distL="0" distR="0" wp14:anchorId="2EB8A86E" wp14:editId="40CB48A3">
-            <wp:extent cx="5961148" cy="2417577"/>
+          <wp:inline distT="0" distB="0" distL="0" distR="0" wp14:anchorId="2EB8A86E" wp14:editId="12E80D99">
+            <wp:extent cx="5961148" cy="2393846"/>
             <wp:effectExtent l="0" t="0" r="0" b="0"/>
             <wp:docPr id="1" name="Picture 1"/>
             <wp:cNvGraphicFramePr>
@@ -406,7 +406,7 @@
                   <pic:spPr>
                     <a:xfrm>
                       <a:off x="0" y="0"/>
-                      <a:ext cx="5961148" cy="2417577"/>
+                      <a:ext cx="5961148" cy="2393846"/>
                     </a:xfrm>
                     <a:prstGeom prst="rect">
                       <a:avLst/>
@@ -1687,9 +1687,9 @@
           <w:noProof/>
         </w:rPr>
         <w:drawing>
-          <wp:inline distT="0" distB="0" distL="0" distR="0" wp14:anchorId="6AFFAAB4" wp14:editId="65FA8904">
-            <wp:extent cx="4561920" cy="4390096"/>
-            <wp:effectExtent l="0" t="0" r="0" b="4445"/>
+          <wp:inline distT="0" distB="0" distL="0" distR="0" wp14:anchorId="6AFFAAB4" wp14:editId="65268C7A">
+            <wp:extent cx="4658743" cy="4391790"/>
+            <wp:effectExtent l="0" t="0" r="2540" b="2540"/>
             <wp:docPr id="5" name="Picture 5"/>
             <wp:cNvGraphicFramePr>
               <a:graphicFrameLocks xmlns:a="http://schemas.openxmlformats.org/drawingml/2006/main" noChangeAspect="1"/>
@@ -1716,7 +1716,7 @@
                   <pic:spPr>
                     <a:xfrm>
                       <a:off x="0" y="0"/>
-                      <a:ext cx="4561920" cy="4390096"/>
+                      <a:ext cx="4664888" cy="4397582"/>
                     </a:xfrm>
                     <a:prstGeom prst="rect">
                       <a:avLst/>
@@ -1736,7 +1736,27 @@
         <w:jc w:val="both"/>
       </w:pPr>
       <w:r>
-        <w:t xml:space="preserve">The Security SME and the Development SME review the </w:t>
+        <w:t xml:space="preserve">The </w:t>
+      </w:r>
+      <w:r>
+        <w:rPr>
+          <w:b/>
+          <w:bCs/>
+        </w:rPr>
+        <w:t>Security SME</w:t>
+      </w:r>
+      <w:r>
+        <w:t xml:space="preserve"> and </w:t>
+      </w:r>
+      <w:r>
+        <w:rPr>
+          <w:b/>
+          <w:bCs/>
+        </w:rPr>
+        <w:t>Development SME</w:t>
+      </w:r>
+      <w:r>
+        <w:t xml:space="preserve"> review the </w:t>
       </w:r>
       <w:r>
         <w:rPr>
@@ -1805,94 +1825,10 @@
         <w:t>ion</w:t>
       </w:r>
       <w:r>
-        <w:t>. For any such, an issue will be created in the issue tracking system.</w:t>
-      </w:r>
-      <w:r>
-        <w:t xml:space="preserve"> A </w:t>
-      </w:r>
-      <w:r>
-        <w:rPr>
-          <w:b/>
-          <w:bCs/>
-        </w:rPr>
-        <w:t>Static</w:t>
-      </w:r>
-      <w:r>
-        <w:rPr>
-          <w:b/>
-          <w:bCs/>
-        </w:rPr>
-        <w:t xml:space="preserve"> </w:t>
-      </w:r>
-      <w:r>
-        <w:rPr>
-          <w:b/>
-          <w:bCs/>
-        </w:rPr>
-        <w:t>A</w:t>
-      </w:r>
-      <w:r>
-        <w:rPr>
-          <w:b/>
-          <w:bCs/>
-        </w:rPr>
-        <w:t xml:space="preserve">nalysis </w:t>
-      </w:r>
-      <w:r>
-        <w:rPr>
-          <w:b/>
-          <w:bCs/>
-        </w:rPr>
-        <w:t>R</w:t>
-      </w:r>
-      <w:r>
-        <w:rPr>
-          <w:b/>
-          <w:bCs/>
-        </w:rPr>
-        <w:t>eport</w:t>
-      </w:r>
-      <w:r>
-        <w:t xml:space="preserve"> will be generated.</w:t>
-      </w:r>
-    </w:p>
-    <w:p>
-      <w:pPr>
-        <w:pStyle w:val="Heading3"/>
-      </w:pPr>
-      <w:r>
-        <w:t>Identified Issues</w:t>
-      </w:r>
-    </w:p>
-    <w:p>
-      <w:pPr>
-        <w:jc w:val="both"/>
-      </w:pPr>
-      <w:r>
-        <w:t xml:space="preserve">The recommended form of the </w:t>
-      </w:r>
-      <w:r>
-        <w:rPr>
-          <w:b/>
-          <w:bCs/>
-        </w:rPr>
-        <w:t>Identified Issues</w:t>
-      </w:r>
-      <w:r>
-        <w:t xml:space="preserve"> artifact is a Static Analysis Results Interchange Format (</w:t>
-      </w:r>
-      <w:r>
-        <w:rPr>
-          <w:b/>
-          <w:bCs/>
-        </w:rPr>
-        <w:t>SARIF</w:t>
-      </w:r>
-      <w:r>
-        <w:t>) encoded JSON</w:t>
-      </w:r>
-      <w:r>
-        <w:t xml:space="preserve">. This document assumes SARIF version 2.1.0 </w:t>
+        <w:t xml:space="preserve">. </w:t>
+      </w:r>
+      <w:r>
+        <w:t xml:space="preserve">Identified issues are sent to the threat prioritization process </w:t>
       </w:r>
       <w:r>
         <w:rPr>
@@ -1901,6 +1837,135 @@
           <w:color w:val="0070C0"/>
           <w:vertAlign w:val="superscript"/>
         </w:rPr>
+        <w:t>[6]</w:t>
+      </w:r>
+      <w:r>
+        <w:t>.</w:t>
+      </w:r>
+      <w:r>
+        <w:t xml:space="preserve"> A </w:t>
+      </w:r>
+      <w:r>
+        <w:rPr>
+          <w:b/>
+          <w:bCs/>
+        </w:rPr>
+        <w:t>Static</w:t>
+      </w:r>
+      <w:r>
+        <w:rPr>
+          <w:b/>
+          <w:bCs/>
+        </w:rPr>
+        <w:t xml:space="preserve"> </w:t>
+      </w:r>
+      <w:r>
+        <w:rPr>
+          <w:b/>
+          <w:bCs/>
+        </w:rPr>
+        <w:t>A</w:t>
+      </w:r>
+      <w:r>
+        <w:rPr>
+          <w:b/>
+          <w:bCs/>
+        </w:rPr>
+        <w:t xml:space="preserve">nalysis </w:t>
+      </w:r>
+      <w:r>
+        <w:rPr>
+          <w:b/>
+          <w:bCs/>
+        </w:rPr>
+        <w:t>R</w:t>
+      </w:r>
+      <w:r>
+        <w:rPr>
+          <w:b/>
+          <w:bCs/>
+        </w:rPr>
+        <w:t>eport</w:t>
+      </w:r>
+      <w:r>
+        <w:t xml:space="preserve"> will be generated.</w:t>
+      </w:r>
+    </w:p>
+    <w:p>
+      <w:pPr>
+        <w:ind w:left="720" w:hanging="720"/>
+        <w:jc w:val="both"/>
+      </w:pPr>
+      <w:r>
+        <w:rPr>
+          <w:b/>
+          <w:bCs/>
+          <w:color w:val="0070C0"/>
+        </w:rPr>
+        <w:t>Note:</w:t>
+      </w:r>
+      <w:r>
+        <w:tab/>
+      </w:r>
+      <w:r>
+        <w:t>Depending on the nature of the identified issue, it may be entered directly into the issue tracking system</w:t>
+      </w:r>
+      <w:r>
+        <w:t>.</w:t>
+      </w:r>
+    </w:p>
+    <w:p>
+      <w:pPr>
+        <w:ind w:left="720" w:hanging="720"/>
+        <w:jc w:val="both"/>
+      </w:pPr>
+    </w:p>
+    <w:p>
+      <w:pPr>
+        <w:pStyle w:val="Heading2"/>
+      </w:pPr>
+      <w:r>
+        <w:lastRenderedPageBreak/>
+        <w:t>Identified Issues</w:t>
+      </w:r>
+    </w:p>
+    <w:p>
+      <w:pPr>
+        <w:jc w:val="both"/>
+      </w:pPr>
+      <w:r>
+        <w:t xml:space="preserve">The recommended form of the </w:t>
+      </w:r>
+      <w:r>
+        <w:rPr>
+          <w:b/>
+          <w:bCs/>
+        </w:rPr>
+        <w:t>Identified Issues</w:t>
+      </w:r>
+      <w:r>
+        <w:t xml:space="preserve"> artifact is a Static Analysis Results Interchange Format (</w:t>
+      </w:r>
+      <w:r>
+        <w:rPr>
+          <w:b/>
+          <w:bCs/>
+        </w:rPr>
+        <w:t>SARIF</w:t>
+      </w:r>
+      <w:r>
+        <w:t>) encoded JSON</w:t>
+      </w:r>
+      <w:r>
+        <w:t xml:space="preserve">. This document assumes SARIF version 2.1.0 </w:t>
+      </w:r>
+      <w:r>
+        <w:rPr>
+          <w:b/>
+          <w:bCs/>
+          <w:color w:val="0070C0"/>
+          <w:vertAlign w:val="superscript"/>
+        </w:rPr>
         <w:t xml:space="preserve">[1] </w:t>
       </w:r>
       <w:r>
@@ -1912,7 +1977,6 @@
         <w:pStyle w:val="Heading3"/>
       </w:pPr>
       <w:r>
-        <w:lastRenderedPageBreak/>
         <w:t>Static Analysis Report</w:t>
       </w:r>
     </w:p>
@@ -2313,22 +2377,6 @@
       </w:pPr>
       <w:r>
         <w:t>Reference (optional) to the associated taxonomy entry</w:t>
-      </w:r>
-    </w:p>
-    <w:p>
-      <w:pPr>
-        <w:spacing w:after="240"/>
-      </w:pPr>
-    </w:p>
-    <w:p>
-      <w:pPr>
-        <w:rPr>
-          <w:sz w:val="40"/>
-          <w:szCs w:val="40"/>
-        </w:rPr>
-      </w:pPr>
-      <w:r>
-        <w:br w:type="page"/>
       </w:r>
     </w:p>
     <w:p>
@@ -2543,6 +2591,33 @@
           <w:color w:val="000000" w:themeColor="text1"/>
         </w:rPr>
         <w:t>document)</w:t>
+      </w:r>
+    </w:p>
+    <w:p>
+      <w:pPr>
+        <w:pStyle w:val="ListParagraph"/>
+        <w:numPr>
+          <w:ilvl w:val="0"/>
+          <w:numId w:val="7"/>
+        </w:numPr>
+        <w:ind w:left="360"/>
+        <w:rPr>
+          <w:color w:val="000000" w:themeColor="text1"/>
+        </w:rPr>
+      </w:pPr>
+      <w:r>
+        <w:rPr>
+          <w:b/>
+          <w:bCs/>
+          <w:color w:val="000000" w:themeColor="text1"/>
+        </w:rPr>
+        <w:t xml:space="preserve">Threat Prioritization Plan </w:t>
+      </w:r>
+      <w:r>
+        <w:rPr>
+          <w:color w:val="000000" w:themeColor="text1"/>
+        </w:rPr>
+        <w:t>(AVCDL secondary document)</w:t>
       </w:r>
     </w:p>
     <w:p/>

</xml_diff>

<commit_message>
updated the static analysis process workflow diagram (updated triage handling) / updated the Static Analysis Report secondary document (updated workflow diagram)
</commit_message>
<xml_diff>
--- a/source/reference_documents/secondary_documents/implementation phase/Static Analysis Report/Static Analysis Report.docx
+++ b/source/reference_documents/secondary_documents/implementation phase/Static Analysis Report/Static Analysis Report.docx
@@ -28,7 +28,7 @@
         <w:t xml:space="preserve">Version </w:t>
       </w:r>
       <w:r>
-        <w:t>5</w:t>
+        <w:t>6</w:t>
       </w:r>
     </w:p>
     <w:p>
@@ -45,7 +45,7 @@
         <w:rPr>
           <w:noProof/>
         </w:rPr>
-        <w:t>1/9/26 11:22 AM</w:t>
+        <w:t>2/13/26 12:52 PM</w:t>
       </w:r>
       <w:r>
         <w:fldChar w:fldCharType="end"/>
@@ -377,8 +377,8 @@
           <w:noProof/>
         </w:rPr>
         <w:drawing>
-          <wp:inline distT="0" distB="0" distL="0" distR="0" wp14:anchorId="2EB8A86E" wp14:editId="12E80D99">
-            <wp:extent cx="5961148" cy="2393846"/>
+          <wp:inline distT="0" distB="0" distL="0" distR="0" wp14:anchorId="2EB8A86E" wp14:editId="68D2D6C0">
+            <wp:extent cx="5961148" cy="2301427"/>
             <wp:effectExtent l="0" t="0" r="0" b="0"/>
             <wp:docPr id="1" name="Picture 1"/>
             <wp:cNvGraphicFramePr>
@@ -406,7 +406,7 @@
                   <pic:spPr>
                     <a:xfrm>
                       <a:off x="0" y="0"/>
-                      <a:ext cx="5961148" cy="2393846"/>
+                      <a:ext cx="5961148" cy="2301427"/>
                     </a:xfrm>
                     <a:prstGeom prst="rect">
                       <a:avLst/>
@@ -1687,9 +1687,9 @@
           <w:noProof/>
         </w:rPr>
         <w:drawing>
-          <wp:inline distT="0" distB="0" distL="0" distR="0" wp14:anchorId="6AFFAAB4" wp14:editId="65268C7A">
-            <wp:extent cx="4658743" cy="4391790"/>
-            <wp:effectExtent l="0" t="0" r="2540" b="2540"/>
+          <wp:inline distT="0" distB="0" distL="0" distR="0" wp14:anchorId="6AFFAAB4" wp14:editId="39B4D16B">
+            <wp:extent cx="5096924" cy="4390930"/>
+            <wp:effectExtent l="0" t="0" r="0" b="3810"/>
             <wp:docPr id="5" name="Picture 5"/>
             <wp:cNvGraphicFramePr>
               <a:graphicFrameLocks xmlns:a="http://schemas.openxmlformats.org/drawingml/2006/main" noChangeAspect="1"/>
@@ -1716,7 +1716,7 @@
                   <pic:spPr>
                     <a:xfrm>
                       <a:off x="0" y="0"/>
-                      <a:ext cx="4664888" cy="4397582"/>
+                      <a:ext cx="5128119" cy="4417804"/>
                     </a:xfrm>
                     <a:prstGeom prst="rect">
                       <a:avLst/>
@@ -1906,12 +1906,13 @@
       </w:r>
       <w:r>
         <w:tab/>
-      </w:r>
-      <w:r>
-        <w:t>Depending on the nature of the identified issue, it may be entered directly into the issue tracking system</w:t>
-      </w:r>
-      <w:r>
-        <w:t>.</w:t>
+        <w:t xml:space="preserve">Depending on the nature of </w:t>
+      </w:r>
+      <w:r>
+        <w:t>an</w:t>
+      </w:r>
+      <w:r>
+        <w:t xml:space="preserve"> identified issue, it may be entered directly into the issue tracking system.</w:t>
       </w:r>
     </w:p>
     <w:p>

</xml_diff>